<commit_message>
Create system architecture doc
</commit_message>
<xml_diff>
--- a/docs/Report/System Architecture.docx
+++ b/docs/Report/System Architecture.docx
@@ -7,26 +7,904 @@
         <w:pStyle w:val="Heading1"/>
       </w:pPr>
       <w:r>
-        <w:t>Heading</w:t>
-      </w:r>
-      <w:r>
+        <w:t>System Architecture</w:t>
+      </w:r>
+    </w:p>
+    <w:p>
+      <w:pPr>
+        <w:pStyle w:val="Heading2"/>
+      </w:pPr>
+      <w:r>
+        <w:t>Overview</w:t>
+      </w:r>
+    </w:p>
+    <w:p>
+      <w:pPr>
+        <w:jc w:val="both"/>
+      </w:pPr>
+      <w:r>
+        <w:tab/>
+        <w:t xml:space="preserve">This system is a monolith </w:t>
+      </w:r>
+      <w:r>
+        <w:t>three</w:t>
+      </w:r>
+      <w:r>
+        <w:t>-tier distributed architecture</w:t>
+      </w:r>
+      <w:r>
+        <w:t>: Presentation tier, frontend; Application tier, backend; and Data tier, Database.</w:t>
+      </w:r>
+    </w:p>
+    <w:p>
+      <w:pPr>
+        <w:jc w:val="both"/>
+      </w:pPr>
+      <w:r>
+        <w:tab/>
+        <w:t>Presentation tier, implemented using React, is the layer with which the clients interact. It houses the user-interface UI and communicates with the application tier through HTTPS and REST APIs.</w:t>
+      </w:r>
+    </w:p>
+    <w:p>
+      <w:pPr>
+        <w:jc w:val="both"/>
+      </w:pPr>
+      <w:r>
+        <w:tab/>
+        <w:t>The application tier is the heart of the system; it contains all the business logic and coordinates the present modules. It communicates with both the presentation and database layers.</w:t>
+      </w:r>
+    </w:p>
+    <w:p>
+      <w:pPr>
+        <w:jc w:val="both"/>
+      </w:pPr>
+      <w:r>
+        <w:tab/>
+        <w:t>The database tier contains all the data needed for the system. It communicates with the application tier through JDBC API.</w:t>
+      </w:r>
+    </w:p>
+    <w:p>
+      <w:pPr>
+        <w:jc w:val="both"/>
+      </w:pPr>
+    </w:p>
+    <w:p>
+      <w:pPr>
+        <w:pStyle w:val="Heading2"/>
+      </w:pPr>
+      <w:r>
+        <w:t>High-Level Diagram</w:t>
+      </w:r>
+    </w:p>
+    <w:p>
+      <w:r>
+        <w:rPr>
+          <w:noProof/>
+        </w:rPr>
+        <w:drawing>
+          <wp:inline distT="0" distB="0" distL="0" distR="0" wp14:anchorId="4DCDF0BE" wp14:editId="489E10F3">
+            <wp:extent cx="5274310" cy="4144645"/>
+            <wp:effectExtent l="152400" t="152400" r="364490" b="351155"/>
+            <wp:docPr id="2" name="Picture 2"/>
+            <wp:cNvGraphicFramePr>
+              <a:graphicFrameLocks xmlns:a="http://schemas.openxmlformats.org/drawingml/2006/main" noChangeAspect="1"/>
+            </wp:cNvGraphicFramePr>
+            <a:graphic xmlns:a="http://schemas.openxmlformats.org/drawingml/2006/main">
+              <a:graphicData uri="http://schemas.openxmlformats.org/drawingml/2006/picture">
+                <pic:pic xmlns:pic="http://schemas.openxmlformats.org/drawingml/2006/picture">
+                  <pic:nvPicPr>
+                    <pic:cNvPr id="0" name="Picture 6"/>
+                    <pic:cNvPicPr>
+                      <a:picLocks noChangeAspect="1" noChangeArrowheads="1"/>
+                    </pic:cNvPicPr>
+                  </pic:nvPicPr>
+                  <pic:blipFill>
+                    <a:blip r:embed="rId5">
+                      <a:extLst>
+                        <a:ext uri="{28A0092B-C50C-407E-A947-70E740481C1C}">
+                          <a14:useLocalDpi xmlns:a14="http://schemas.microsoft.com/office/drawing/2010/main" val="0"/>
+                        </a:ext>
+                      </a:extLst>
+                    </a:blip>
+                    <a:srcRect/>
+                    <a:stretch>
+                      <a:fillRect/>
+                    </a:stretch>
+                  </pic:blipFill>
+                  <pic:spPr bwMode="auto">
+                    <a:xfrm>
+                      <a:off x="0" y="0"/>
+                      <a:ext cx="5274310" cy="4144645"/>
+                    </a:xfrm>
+                    <a:prstGeom prst="rect">
+                      <a:avLst/>
+                    </a:prstGeom>
+                    <a:ln>
+                      <a:noFill/>
+                    </a:ln>
+                    <a:effectLst>
+                      <a:outerShdw blurRad="292100" dist="139700" dir="2700000" algn="tl" rotWithShape="0">
+                        <a:srgbClr val="333333">
+                          <a:alpha val="65000"/>
+                        </a:srgbClr>
+                      </a:outerShdw>
+                    </a:effectLst>
+                  </pic:spPr>
+                </pic:pic>
+              </a:graphicData>
+            </a:graphic>
+          </wp:inline>
+        </w:drawing>
+      </w:r>
+    </w:p>
+    <w:p>
+      <w:r>
+        <w:br w:type="page"/>
+      </w:r>
+    </w:p>
+    <w:p>
+      <w:pPr>
+        <w:pStyle w:val="Heading2"/>
+      </w:pPr>
+      <w:r>
+        <w:lastRenderedPageBreak/>
+        <w:t>Detailed Backend Layout</w:t>
+      </w:r>
+    </w:p>
+    <w:p>
+      <w:r>
+        <w:rPr>
+          <w:noProof/>
+        </w:rPr>
+        <w:drawing>
+          <wp:inline distT="0" distB="0" distL="0" distR="0" wp14:anchorId="547BA300" wp14:editId="77EC782B">
+            <wp:extent cx="5274310" cy="4682490"/>
+            <wp:effectExtent l="133350" t="152400" r="345440" b="346710"/>
+            <wp:docPr id="3" name="Picture 3"/>
+            <wp:cNvGraphicFramePr>
+              <a:graphicFrameLocks xmlns:a="http://schemas.openxmlformats.org/drawingml/2006/main" noChangeAspect="1"/>
+            </wp:cNvGraphicFramePr>
+            <a:graphic xmlns:a="http://schemas.openxmlformats.org/drawingml/2006/main">
+              <a:graphicData uri="http://schemas.openxmlformats.org/drawingml/2006/picture">
+                <pic:pic xmlns:pic="http://schemas.openxmlformats.org/drawingml/2006/picture">
+                  <pic:nvPicPr>
+                    <pic:cNvPr id="0" name="Picture 8"/>
+                    <pic:cNvPicPr>
+                      <a:picLocks noChangeAspect="1" noChangeArrowheads="1"/>
+                    </pic:cNvPicPr>
+                  </pic:nvPicPr>
+                  <pic:blipFill>
+                    <a:blip r:embed="rId6">
+                      <a:extLst>
+                        <a:ext uri="{28A0092B-C50C-407E-A947-70E740481C1C}">
+                          <a14:useLocalDpi xmlns:a14="http://schemas.microsoft.com/office/drawing/2010/main" val="0"/>
+                        </a:ext>
+                      </a:extLst>
+                    </a:blip>
+                    <a:srcRect/>
+                    <a:stretch>
+                      <a:fillRect/>
+                    </a:stretch>
+                  </pic:blipFill>
+                  <pic:spPr bwMode="auto">
+                    <a:xfrm>
+                      <a:off x="0" y="0"/>
+                      <a:ext cx="5274310" cy="4682490"/>
+                    </a:xfrm>
+                    <a:prstGeom prst="rect">
+                      <a:avLst/>
+                    </a:prstGeom>
+                    <a:ln>
+                      <a:noFill/>
+                    </a:ln>
+                    <a:effectLst>
+                      <a:outerShdw blurRad="292100" dist="139700" dir="2700000" algn="tl" rotWithShape="0">
+                        <a:srgbClr val="333333">
+                          <a:alpha val="65000"/>
+                        </a:srgbClr>
+                      </a:outerShdw>
+                    </a:effectLst>
+                  </pic:spPr>
+                </pic:pic>
+              </a:graphicData>
+            </a:graphic>
+          </wp:inline>
+        </w:drawing>
+      </w:r>
+    </w:p>
+    <w:p>
+      <w:pPr>
+        <w:pStyle w:val="Heading3"/>
+      </w:pPr>
+      <w:r>
+        <w:t>Internal Modules</w:t>
+      </w:r>
+    </w:p>
+    <w:p>
+      <w:pPr>
+        <w:jc w:val="both"/>
+      </w:pPr>
+      <w:r>
+        <w:tab/>
+        <w:t>The backend is implemented as a Spring Boot monolith and is internally structured into modules and layers to achieve separation of concerns. The internal architecture is patterned into controller, service, and repository.</w:t>
+      </w:r>
+    </w:p>
+    <w:p>
+      <w:pPr>
+        <w:jc w:val="both"/>
+      </w:pPr>
+      <w:r>
+        <w:tab/>
+        <w:t>The controller deals with HTTPS requests to communicate with the frontend layer and returns the HTTPS response. It passes its data to the service class.</w:t>
+      </w:r>
+    </w:p>
+    <w:p>
+      <w:pPr>
+        <w:jc w:val="both"/>
+      </w:pPr>
+      <w:r>
+        <w:tab/>
+        <w:t>The service contains all the business logic of the entity it deals with, e.g., users. It processes operations, validate conditions, and coordinates with repositories. It is the core of the system’s logic.</w:t>
+      </w:r>
+    </w:p>
+    <w:p>
+      <w:pPr>
+        <w:jc w:val="both"/>
+        <w:rPr>
+          <w:lang w:bidi="ar-EG"/>
+        </w:rPr>
+      </w:pPr>
+      <w:r>
+        <w:tab/>
+        <w:t xml:space="preserve">The repository manages data </w:t>
+      </w:r>
+      <w:r>
+        <w:rPr>
+          <w:lang w:bidi="ar-EG"/>
+        </w:rPr>
+        <w:t>access and consistency. They provided an abstraction over the database tier and allows the service layer to manipulate the data entities without writing any low-level SQL queries.</w:t>
+      </w:r>
+    </w:p>
+    <w:p>
+      <w:r>
+        <w:br w:type="page"/>
+      </w:r>
+    </w:p>
+    <w:p>
+      <w:pPr>
+        <w:pStyle w:val="Heading3"/>
+      </w:pPr>
+      <w:r>
+        <w:lastRenderedPageBreak/>
+        <w:t>REST Features</w:t>
+      </w:r>
+    </w:p>
+    <w:p/>
+    <w:p/>
+    <w:p>
+      <w:r>
+        <w:br w:type="page"/>
+      </w:r>
+    </w:p>
+    <w:p>
+      <w:pPr>
+        <w:pStyle w:val="Heading3"/>
+      </w:pPr>
+      <w:r>
+        <w:lastRenderedPageBreak/>
+        <w:t>Shared Models</w:t>
+      </w:r>
+    </w:p>
+    <w:p>
+      <w:pPr>
+        <w:jc w:val="both"/>
+        <w:rPr>
+          <w:lang w:bidi="ar-EG"/>
+        </w:rPr>
+      </w:pPr>
+      <w:r>
+        <w:rPr>
+          <w:rtl/>
+          <w:lang w:bidi="ar-EG"/>
+        </w:rPr>
+        <w:tab/>
+      </w:r>
+      <w:r>
+        <w:rPr>
+          <w:lang w:bidi="ar-EG"/>
+        </w:rPr>
+        <w:t>These common models are centralized to be used by the whole system to avoid redundancy and improve consistency.</w:t>
+      </w:r>
+      <w:r>
+        <w:rPr>
+          <w:lang w:bidi="ar-EG"/>
+        </w:rPr>
         <w:t xml:space="preserve"> </w:t>
       </w:r>
-    </w:p>
-    <w:p>
-      <w:pPr>
-        <w:jc w:val="both"/>
-      </w:pPr>
-    </w:p>
-    <w:p>
-      <w:pPr>
-        <w:jc w:val="both"/>
-      </w:pPr>
-    </w:p>
-    <w:p>
-      <w:pPr>
-        <w:jc w:val="both"/>
-      </w:pPr>
+      <w:r>
+        <w:rPr>
+          <w:lang w:bidi="ar-EG"/>
+        </w:rPr>
+        <w:t>They</w:t>
+      </w:r>
+      <w:r>
+        <w:rPr>
+          <w:lang w:bidi="ar-EG"/>
+        </w:rPr>
+        <w:t xml:space="preserve"> represent the core business objects stored in the database.</w:t>
+      </w:r>
+    </w:p>
+    <w:p>
+      <w:pPr>
+        <w:ind w:firstLine="720"/>
+        <w:jc w:val="both"/>
+        <w:rPr>
+          <w:lang w:bidi="ar-EG"/>
+        </w:rPr>
+      </w:pPr>
+      <w:r>
+        <w:rPr>
+          <w:lang w:bidi="ar-EG"/>
+        </w:rPr>
+        <w:t xml:space="preserve">The design rule is that any model used by multiple modules is placed in </w:t>
+      </w:r>
+      <w:r>
+        <w:rPr>
+          <w:lang w:bidi="ar-EG"/>
+        </w:rPr>
+        <w:t xml:space="preserve">the </w:t>
+      </w:r>
+      <w:r>
+        <w:rPr>
+          <w:lang w:bidi="ar-EG"/>
+        </w:rPr>
+        <w:t>shared</w:t>
+      </w:r>
+      <w:r>
+        <w:rPr>
+          <w:lang w:bidi="ar-EG"/>
+        </w:rPr>
+        <w:t xml:space="preserve"> models,</w:t>
+      </w:r>
+      <w:r>
+        <w:rPr>
+          <w:lang w:bidi="ar-EG"/>
+        </w:rPr>
+        <w:t xml:space="preserve"> while models used by only one module remain local to that module. </w:t>
+      </w:r>
+    </w:p>
+    <w:p>
+      <w:pPr>
+        <w:jc w:val="both"/>
+        <w:rPr>
+          <w:b/>
+          <w:bCs/>
+          <w:lang w:bidi="ar-EG"/>
+        </w:rPr>
+      </w:pPr>
+      <w:r>
+        <w:rPr>
+          <w:b/>
+          <w:bCs/>
+          <w:lang w:bidi="ar-EG"/>
+        </w:rPr>
+        <w:t>Shared Entities:</w:t>
+      </w:r>
+    </w:p>
+    <w:p>
+      <w:pPr>
+        <w:pStyle w:val="ListParagraph"/>
+        <w:numPr>
+          <w:ilvl w:val="0"/>
+          <w:numId w:val="7"/>
+        </w:numPr>
+        <w:jc w:val="both"/>
+        <w:rPr>
+          <w:lang w:bidi="ar-EG"/>
+        </w:rPr>
+      </w:pPr>
+      <w:r>
+        <w:rPr>
+          <w:lang w:bidi="ar-EG"/>
+        </w:rPr>
+        <w:t>User</w:t>
+      </w:r>
+    </w:p>
+    <w:p>
+      <w:pPr>
+        <w:pStyle w:val="ListParagraph"/>
+        <w:numPr>
+          <w:ilvl w:val="0"/>
+          <w:numId w:val="7"/>
+        </w:numPr>
+        <w:jc w:val="both"/>
+        <w:rPr>
+          <w:lang w:bidi="ar-EG"/>
+        </w:rPr>
+      </w:pPr>
+      <w:r>
+        <w:rPr>
+          <w:lang w:bidi="ar-EG"/>
+        </w:rPr>
+        <w:t>Item</w:t>
+      </w:r>
+    </w:p>
+    <w:p>
+      <w:pPr>
+        <w:pStyle w:val="ListParagraph"/>
+        <w:numPr>
+          <w:ilvl w:val="0"/>
+          <w:numId w:val="7"/>
+        </w:numPr>
+        <w:jc w:val="both"/>
+        <w:rPr>
+          <w:lang w:bidi="ar-EG"/>
+        </w:rPr>
+      </w:pPr>
+      <w:r>
+        <w:rPr>
+          <w:lang w:bidi="ar-EG"/>
+        </w:rPr>
+        <w:t>Transaction</w:t>
+      </w:r>
+    </w:p>
+    <w:p>
+      <w:pPr>
+        <w:pStyle w:val="ListParagraph"/>
+        <w:numPr>
+          <w:ilvl w:val="0"/>
+          <w:numId w:val="7"/>
+        </w:numPr>
+        <w:jc w:val="both"/>
+        <w:rPr>
+          <w:lang w:bidi="ar-EG"/>
+        </w:rPr>
+      </w:pPr>
+      <w:r>
+        <w:rPr>
+          <w:lang w:bidi="ar-EG"/>
+        </w:rPr>
+        <w:t>Inventory</w:t>
+      </w:r>
+    </w:p>
+    <w:p>
+      <w:pPr>
+        <w:jc w:val="both"/>
+        <w:rPr>
+          <w:b/>
+          <w:bCs/>
+          <w:lang w:bidi="ar-EG"/>
+        </w:rPr>
+      </w:pPr>
+      <w:r>
+        <w:rPr>
+          <w:b/>
+          <w:bCs/>
+          <w:lang w:bidi="ar-EG"/>
+        </w:rPr>
+        <w:t>Shared DTO’s</w:t>
+      </w:r>
+    </w:p>
+    <w:p>
+      <w:pPr>
+        <w:pStyle w:val="ListParagraph"/>
+        <w:numPr>
+          <w:ilvl w:val="0"/>
+          <w:numId w:val="8"/>
+        </w:numPr>
+        <w:jc w:val="both"/>
+        <w:rPr>
+          <w:lang w:bidi="ar-EG"/>
+        </w:rPr>
+      </w:pPr>
+      <w:proofErr w:type="spellStart"/>
+      <w:r>
+        <w:rPr>
+          <w:lang w:bidi="ar-EG"/>
+        </w:rPr>
+        <w:t>UserResponseDto</w:t>
+      </w:r>
+      <w:proofErr w:type="spellEnd"/>
+    </w:p>
+    <w:p>
+      <w:pPr>
+        <w:pStyle w:val="ListParagraph"/>
+        <w:numPr>
+          <w:ilvl w:val="0"/>
+          <w:numId w:val="8"/>
+        </w:numPr>
+        <w:jc w:val="both"/>
+        <w:rPr>
+          <w:lang w:bidi="ar-EG"/>
+        </w:rPr>
+      </w:pPr>
+      <w:proofErr w:type="spellStart"/>
+      <w:r>
+        <w:rPr>
+          <w:lang w:bidi="ar-EG"/>
+        </w:rPr>
+        <w:t>ItemDto</w:t>
+      </w:r>
+      <w:proofErr w:type="spellEnd"/>
+    </w:p>
+    <w:p>
+      <w:pPr>
+        <w:pStyle w:val="ListParagraph"/>
+        <w:numPr>
+          <w:ilvl w:val="0"/>
+          <w:numId w:val="8"/>
+        </w:numPr>
+        <w:jc w:val="both"/>
+        <w:rPr>
+          <w:lang w:bidi="ar-EG"/>
+        </w:rPr>
+      </w:pPr>
+      <w:proofErr w:type="spellStart"/>
+      <w:r>
+        <w:rPr>
+          <w:lang w:bidi="ar-EG"/>
+        </w:rPr>
+        <w:t>TransactionDto</w:t>
+      </w:r>
+      <w:proofErr w:type="spellEnd"/>
+    </w:p>
+    <w:p>
+      <w:pPr>
+        <w:ind w:firstLine="360"/>
+        <w:jc w:val="both"/>
+        <w:rPr>
+          <w:lang w:bidi="ar-EG"/>
+        </w:rPr>
+      </w:pPr>
+      <w:r>
+        <w:rPr>
+          <w:lang w:bidi="ar-EG"/>
+        </w:rPr>
+        <w:t xml:space="preserve">DTO’s </w:t>
+      </w:r>
+      <w:r>
+        <w:rPr>
+          <w:lang w:bidi="ar-EG"/>
+        </w:rPr>
+        <w:t>are used to transfer structured data between backend and frontend without directly exposing internal entity classes.</w:t>
+      </w:r>
+    </w:p>
+    <w:p>
+      <w:pPr>
+        <w:jc w:val="both"/>
+        <w:rPr>
+          <w:b/>
+          <w:bCs/>
+          <w:lang w:bidi="ar-EG"/>
+        </w:rPr>
+      </w:pPr>
+      <w:r>
+        <w:rPr>
+          <w:b/>
+          <w:bCs/>
+          <w:lang w:bidi="ar-EG"/>
+        </w:rPr>
+        <w:t>Exceptions</w:t>
+      </w:r>
+    </w:p>
+    <w:p>
+      <w:pPr>
+        <w:pStyle w:val="ListParagraph"/>
+        <w:numPr>
+          <w:ilvl w:val="0"/>
+          <w:numId w:val="9"/>
+        </w:numPr>
+        <w:jc w:val="both"/>
+        <w:rPr>
+          <w:lang w:bidi="ar-EG"/>
+        </w:rPr>
+      </w:pPr>
+      <w:proofErr w:type="spellStart"/>
+      <w:r>
+        <w:rPr>
+          <w:lang w:bidi="ar-EG"/>
+        </w:rPr>
+        <w:t>InsufficientBalanceException</w:t>
+      </w:r>
+      <w:proofErr w:type="spellEnd"/>
+    </w:p>
+    <w:p>
+      <w:pPr>
+        <w:pStyle w:val="ListParagraph"/>
+        <w:numPr>
+          <w:ilvl w:val="0"/>
+          <w:numId w:val="9"/>
+        </w:numPr>
+        <w:jc w:val="both"/>
+        <w:rPr>
+          <w:lang w:bidi="ar-EG"/>
+        </w:rPr>
+      </w:pPr>
+      <w:proofErr w:type="spellStart"/>
+      <w:r>
+        <w:rPr>
+          <w:lang w:bidi="ar-EG"/>
+        </w:rPr>
+        <w:t>ItemNotFoundException</w:t>
+      </w:r>
+      <w:proofErr w:type="spellEnd"/>
+    </w:p>
+    <w:p>
+      <w:pPr>
+        <w:pStyle w:val="ListParagraph"/>
+        <w:numPr>
+          <w:ilvl w:val="0"/>
+          <w:numId w:val="9"/>
+        </w:numPr>
+        <w:jc w:val="both"/>
+        <w:rPr>
+          <w:lang w:bidi="ar-EG"/>
+        </w:rPr>
+      </w:pPr>
+      <w:proofErr w:type="spellStart"/>
+      <w:r>
+        <w:rPr>
+          <w:lang w:bidi="ar-EG"/>
+        </w:rPr>
+        <w:t>UserNotFoundException</w:t>
+      </w:r>
+      <w:proofErr w:type="spellEnd"/>
+    </w:p>
+    <w:p>
+      <w:pPr>
+        <w:pStyle w:val="ListParagraph"/>
+        <w:numPr>
+          <w:ilvl w:val="0"/>
+          <w:numId w:val="9"/>
+        </w:numPr>
+        <w:jc w:val="both"/>
+        <w:rPr>
+          <w:lang w:bidi="ar-EG"/>
+        </w:rPr>
+      </w:pPr>
+      <w:proofErr w:type="spellStart"/>
+      <w:r>
+        <w:rPr>
+          <w:lang w:bidi="ar-EG"/>
+        </w:rPr>
+        <w:t>UnauthorizedActionException</w:t>
+      </w:r>
+      <w:proofErr w:type="spellEnd"/>
+    </w:p>
+    <w:p>
+      <w:pPr>
+        <w:ind w:firstLine="360"/>
+        <w:jc w:val="both"/>
+      </w:pPr>
+      <w:r>
+        <w:t>These custom exceptions provide clear and reusable error handling across the system.</w:t>
+      </w:r>
+    </w:p>
+    <w:p>
+      <w:r>
+        <w:br w:type="page"/>
+      </w:r>
+    </w:p>
+    <w:p>
+      <w:pPr>
+        <w:pStyle w:val="Heading2"/>
+      </w:pPr>
+      <w:r>
+        <w:lastRenderedPageBreak/>
+        <w:t>Benefits of this Architecture</w:t>
+      </w:r>
+    </w:p>
+    <w:p>
+      <w:pPr>
+        <w:ind w:firstLine="720"/>
+        <w:jc w:val="both"/>
+      </w:pPr>
+      <w:r>
+        <w:rPr>
+          <w:b/>
+          <w:bCs/>
+        </w:rPr>
+        <w:t>Security:</w:t>
+      </w:r>
+      <w:r>
+        <w:t xml:space="preserve"> The React frontend has no direct database access — all data flows through the application </w:t>
+      </w:r>
+      <w:r>
+        <w:t>tier’s-controlled</w:t>
+      </w:r>
+      <w:r>
+        <w:t xml:space="preserve"> REST interface, which acts as a mandatory gateway for authentication, authorization, and input validation. </w:t>
+      </w:r>
+    </w:p>
+    <w:p>
+      <w:pPr>
+        <w:ind w:firstLine="720"/>
+        <w:jc w:val="both"/>
+      </w:pPr>
+      <w:r>
+        <w:rPr>
+          <w:b/>
+          <w:bCs/>
+        </w:rPr>
+        <w:t>Testability:</w:t>
+      </w:r>
+      <w:r>
+        <w:t xml:space="preserve"> each tier and each internal layer can be tested in isolation</w:t>
+      </w:r>
+      <w:r>
+        <w:t>,</w:t>
+      </w:r>
+      <w:r>
+        <w:t xml:space="preserve"> allowing failures to be precisely located without ambiguity.</w:t>
+      </w:r>
+    </w:p>
+    <w:p>
+      <w:pPr>
+        <w:ind w:firstLine="720"/>
+        <w:jc w:val="both"/>
+      </w:pPr>
+      <w:r>
+        <w:rPr>
+          <w:b/>
+          <w:bCs/>
+        </w:rPr>
+        <w:t>Modularity</w:t>
+      </w:r>
+      <w:r>
+        <w:rPr>
+          <w:b/>
+          <w:bCs/>
+        </w:rPr>
+        <w:t>:</w:t>
+      </w:r>
+      <w:r>
+        <w:t xml:space="preserve"> </w:t>
+      </w:r>
+      <w:r>
+        <w:t>Separating the frontend, backend, and data layers makes the system easier to organize and understand. Within the backend, the layered structure further improves modularity.</w:t>
+      </w:r>
+    </w:p>
+    <w:p>
+      <w:pPr>
+        <w:ind w:firstLine="720"/>
+        <w:jc w:val="both"/>
+      </w:pPr>
+      <w:r>
+        <w:rPr>
+          <w:b/>
+          <w:bCs/>
+        </w:rPr>
+        <w:t>Maintainability</w:t>
+      </w:r>
+      <w:r>
+        <w:rPr>
+          <w:b/>
+          <w:bCs/>
+        </w:rPr>
+        <w:t>:</w:t>
+      </w:r>
+      <w:r>
+        <w:t xml:space="preserve"> </w:t>
+      </w:r>
+      <w:r>
+        <w:t>Controllers, services, and repositories each have a specific responsibility. This makes the code easier to maintain and extend as the system grows.</w:t>
+      </w:r>
+    </w:p>
+    <w:p>
+      <w:pPr>
+        <w:ind w:firstLine="720"/>
+        <w:jc w:val="both"/>
+      </w:pPr>
+      <w:r>
+        <w:rPr>
+          <w:b/>
+          <w:bCs/>
+        </w:rPr>
+        <w:t>Reusability</w:t>
+      </w:r>
+      <w:r>
+        <w:rPr>
+          <w:b/>
+          <w:bCs/>
+        </w:rPr>
+        <w:t>:</w:t>
+      </w:r>
+      <w:r>
+        <w:t xml:space="preserve"> </w:t>
+      </w:r>
+      <w:r>
+        <w:t>The shared models package allows common entities, DTOs, and exceptions to be reused across multiple modules without duplication.</w:t>
+      </w:r>
+    </w:p>
+    <w:p>
+      <w:pPr>
+        <w:ind w:firstLine="720"/>
+        <w:jc w:val="both"/>
+      </w:pPr>
+      <w:r>
+        <w:rPr>
+          <w:b/>
+          <w:bCs/>
+        </w:rPr>
+        <w:t>Scalability</w:t>
+      </w:r>
+      <w:r>
+        <w:rPr>
+          <w:b/>
+          <w:bCs/>
+        </w:rPr>
+        <w:t>:</w:t>
+      </w:r>
+      <w:r>
+        <w:t xml:space="preserve"> </w:t>
+      </w:r>
+      <w:proofErr w:type="spellStart"/>
+      <w:r>
+        <w:t>CockroachDB</w:t>
+      </w:r>
+      <w:proofErr w:type="spellEnd"/>
+      <w:r>
+        <w:t xml:space="preserve"> supports horizontal scaling and distributed storage, which makes the data layer more scalable than a traditional single-node database.</w:t>
+      </w:r>
+    </w:p>
+    <w:p>
+      <w:pPr>
+        <w:ind w:firstLine="720"/>
+        <w:jc w:val="both"/>
+      </w:pPr>
+      <w:r>
+        <w:rPr>
+          <w:b/>
+          <w:bCs/>
+        </w:rPr>
+        <w:t>Clarity</w:t>
+      </w:r>
+      <w:r>
+        <w:rPr>
+          <w:b/>
+          <w:bCs/>
+        </w:rPr>
+        <w:t>:</w:t>
+      </w:r>
+      <w:r>
+        <w:t xml:space="preserve"> </w:t>
+      </w:r>
+      <w:r>
+        <w:t xml:space="preserve">The architecture is straightforward: React handles presentation, Spring Boot handles application logic, and </w:t>
+      </w:r>
+      <w:proofErr w:type="spellStart"/>
+      <w:r>
+        <w:t>CockroachDB</w:t>
+      </w:r>
+      <w:proofErr w:type="spellEnd"/>
+      <w:r>
+        <w:t xml:space="preserve"> handles persistent distributed storage.</w:t>
+      </w:r>
+    </w:p>
+    <w:p>
+      <w:pPr>
+        <w:ind w:firstLine="720"/>
+        <w:jc w:val="both"/>
+      </w:pPr>
+      <w:r>
+        <w:rPr>
+          <w:b/>
+          <w:bCs/>
+        </w:rPr>
+        <w:t>Transparency:</w:t>
+      </w:r>
+      <w:r>
+        <w:t xml:space="preserve"> </w:t>
+      </w:r>
+      <w:r>
+        <w:t xml:space="preserve">The architecture </w:t>
+      </w:r>
+      <w:r>
+        <w:t>hides</w:t>
+      </w:r>
+      <w:r>
+        <w:t xml:space="preserve"> internal implementation complexity from users and higher-level components. For example, the frontend interacts with a unified REST interface without needing to know the details of backend layering or distributed database replication.</w:t>
+      </w:r>
     </w:p>
     <w:p>
       <w:pPr>
@@ -54,6 +932,119 @@
 <file path=word/numbering.xml><?xml version="1.0" encoding="utf-8"?>
 <w:numbering xmlns:wpc="http://schemas.microsoft.com/office/word/2010/wordprocessingCanvas" xmlns:cx="http://schemas.microsoft.com/office/drawing/2014/chartex" xmlns:cx1="http://schemas.microsoft.com/office/drawing/2015/9/8/chartex" xmlns:cx2="http://schemas.microsoft.com/office/drawing/2015/10/21/chartex" xmlns:cx3="http://schemas.microsoft.com/office/drawing/2016/5/9/chartex" xmlns:cx4="http://schemas.microsoft.com/office/drawing/2016/5/10/chartex" xmlns:cx5="http://schemas.microsoft.com/office/drawing/2016/5/11/chartex" xmlns:cx6="http://schemas.microsoft.com/office/drawing/2016/5/12/chartex" xmlns:cx7="http://schemas.microsoft.com/office/drawing/2016/5/13/chartex" xmlns:cx8="http://schemas.microsoft.com/office/drawing/2016/5/14/chartex" xmlns:mc="http://schemas.openxmlformats.org/markup-compatibility/2006" xmlns:aink="http://schemas.microsoft.com/office/drawing/2016/ink" xmlns:am3d="http://schemas.microsoft.com/office/drawing/2017/model3d" xmlns:o="urn:schemas-microsoft-com:office:office" xmlns:oel="http://schemas.microsoft.com/office/2019/extlst" xmlns:r="http://schemas.openxmlformats.org/officeDocument/2006/relationships" xmlns:m="http://schemas.openxmlformats.org/officeDocument/2006/math" xmlns:v="urn:schemas-microsoft-com:vml" xmlns:wp14="http://schemas.microsoft.com/office/word/2010/wordprocessingDrawing" xmlns:wp="http://schemas.openxmlformats.org/drawingml/2006/wordprocessingDrawing" xmlns:w10="urn:schemas-microsoft-com:office:word" xmlns:w="http://schemas.openxmlformats.org/wordprocessingml/2006/main" xmlns:w14="http://schemas.microsoft.com/office/word/2010/wordml" xmlns:w15="http://schemas.microsoft.com/office/word/2012/wordml" xmlns:w16cex="http://schemas.microsoft.com/office/word/2018/wordml/cex" xmlns:w16cid="http://schemas.microsoft.com/office/word/2016/wordml/cid" xmlns:w16="http://schemas.microsoft.com/office/word/2018/wordml" xmlns:w16du="http://schemas.microsoft.com/office/word/2023/wordml/word16du" xmlns:w16sdtdh="http://schemas.microsoft.com/office/word/2020/wordml/sdtdatahash" xmlns:w16se="http://schemas.microsoft.com/office/word/2015/wordml/symex" xmlns:wpg="http://schemas.microsoft.com/office/word/2010/wordprocessingGroup" xmlns:wpi="http://schemas.microsoft.com/office/word/2010/wordprocessingInk" xmlns:wne="http://schemas.microsoft.com/office/word/2006/wordml" xmlns:wps="http://schemas.microsoft.com/office/word/2010/wordprocessingShape" mc:Ignorable="w14 w15 w16se w16cid w16 w16cex w16sdtdh wp14">
   <w:abstractNum w:abstractNumId="0" w15:restartNumberingAfterBreak="0">
+    <w:nsid w:val="01C87830"/>
+    <w:multiLevelType w:val="hybridMultilevel"/>
+    <w:tmpl w:val="38068DE2"/>
+    <w:lvl w:ilvl="0" w:tplc="04090001">
+      <w:start w:val="1"/>
+      <w:numFmt w:val="bullet"/>
+      <w:lvlText w:val=""/>
+      <w:lvlJc w:val="left"/>
+      <w:pPr>
+        <w:ind w:left="720" w:hanging="360"/>
+      </w:pPr>
+      <w:rPr>
+        <w:rFonts w:ascii="Symbol" w:hAnsi="Symbol" w:hint="default"/>
+      </w:rPr>
+    </w:lvl>
+    <w:lvl w:ilvl="1" w:tplc="04090003" w:tentative="1">
+      <w:start w:val="1"/>
+      <w:numFmt w:val="bullet"/>
+      <w:lvlText w:val="o"/>
+      <w:lvlJc w:val="left"/>
+      <w:pPr>
+        <w:ind w:left="1440" w:hanging="360"/>
+      </w:pPr>
+      <w:rPr>
+        <w:rFonts w:ascii="Courier New" w:hAnsi="Courier New" w:cs="Courier New" w:hint="default"/>
+      </w:rPr>
+    </w:lvl>
+    <w:lvl w:ilvl="2" w:tplc="04090005" w:tentative="1">
+      <w:start w:val="1"/>
+      <w:numFmt w:val="bullet"/>
+      <w:lvlText w:val=""/>
+      <w:lvlJc w:val="left"/>
+      <w:pPr>
+        <w:ind w:left="2160" w:hanging="360"/>
+      </w:pPr>
+      <w:rPr>
+        <w:rFonts w:ascii="Wingdings" w:hAnsi="Wingdings" w:hint="default"/>
+      </w:rPr>
+    </w:lvl>
+    <w:lvl w:ilvl="3" w:tplc="04090001" w:tentative="1">
+      <w:start w:val="1"/>
+      <w:numFmt w:val="bullet"/>
+      <w:lvlText w:val=""/>
+      <w:lvlJc w:val="left"/>
+      <w:pPr>
+        <w:ind w:left="2880" w:hanging="360"/>
+      </w:pPr>
+      <w:rPr>
+        <w:rFonts w:ascii="Symbol" w:hAnsi="Symbol" w:hint="default"/>
+      </w:rPr>
+    </w:lvl>
+    <w:lvl w:ilvl="4" w:tplc="04090003" w:tentative="1">
+      <w:start w:val="1"/>
+      <w:numFmt w:val="bullet"/>
+      <w:lvlText w:val="o"/>
+      <w:lvlJc w:val="left"/>
+      <w:pPr>
+        <w:ind w:left="3600" w:hanging="360"/>
+      </w:pPr>
+      <w:rPr>
+        <w:rFonts w:ascii="Courier New" w:hAnsi="Courier New" w:cs="Courier New" w:hint="default"/>
+      </w:rPr>
+    </w:lvl>
+    <w:lvl w:ilvl="5" w:tplc="04090005" w:tentative="1">
+      <w:start w:val="1"/>
+      <w:numFmt w:val="bullet"/>
+      <w:lvlText w:val=""/>
+      <w:lvlJc w:val="left"/>
+      <w:pPr>
+        <w:ind w:left="4320" w:hanging="360"/>
+      </w:pPr>
+      <w:rPr>
+        <w:rFonts w:ascii="Wingdings" w:hAnsi="Wingdings" w:hint="default"/>
+      </w:rPr>
+    </w:lvl>
+    <w:lvl w:ilvl="6" w:tplc="04090001" w:tentative="1">
+      <w:start w:val="1"/>
+      <w:numFmt w:val="bullet"/>
+      <w:lvlText w:val=""/>
+      <w:lvlJc w:val="left"/>
+      <w:pPr>
+        <w:ind w:left="5040" w:hanging="360"/>
+      </w:pPr>
+      <w:rPr>
+        <w:rFonts w:ascii="Symbol" w:hAnsi="Symbol" w:hint="default"/>
+      </w:rPr>
+    </w:lvl>
+    <w:lvl w:ilvl="7" w:tplc="04090003" w:tentative="1">
+      <w:start w:val="1"/>
+      <w:numFmt w:val="bullet"/>
+      <w:lvlText w:val="o"/>
+      <w:lvlJc w:val="left"/>
+      <w:pPr>
+        <w:ind w:left="5760" w:hanging="360"/>
+      </w:pPr>
+      <w:rPr>
+        <w:rFonts w:ascii="Courier New" w:hAnsi="Courier New" w:cs="Courier New" w:hint="default"/>
+      </w:rPr>
+    </w:lvl>
+    <w:lvl w:ilvl="8" w:tplc="04090005" w:tentative="1">
+      <w:start w:val="1"/>
+      <w:numFmt w:val="bullet"/>
+      <w:lvlText w:val=""/>
+      <w:lvlJc w:val="left"/>
+      <w:pPr>
+        <w:ind w:left="6480" w:hanging="360"/>
+      </w:pPr>
+      <w:rPr>
+        <w:rFonts w:ascii="Wingdings" w:hAnsi="Wingdings" w:hint="default"/>
+      </w:rPr>
+    </w:lvl>
+  </w:abstractNum>
+  <w:abstractNum w:abstractNumId="1" w15:restartNumberingAfterBreak="0">
     <w:nsid w:val="07D81549"/>
     <w:multiLevelType w:val="hybridMultilevel"/>
     <w:tmpl w:val="0B9A9498"/>
@@ -166,7 +1157,120 @@
       </w:rPr>
     </w:lvl>
   </w:abstractNum>
-  <w:abstractNum w:abstractNumId="1" w15:restartNumberingAfterBreak="0">
+  <w:abstractNum w:abstractNumId="2" w15:restartNumberingAfterBreak="0">
+    <w:nsid w:val="10D316DA"/>
+    <w:multiLevelType w:val="hybridMultilevel"/>
+    <w:tmpl w:val="B9801AE0"/>
+    <w:lvl w:ilvl="0" w:tplc="04090001">
+      <w:start w:val="1"/>
+      <w:numFmt w:val="bullet"/>
+      <w:lvlText w:val=""/>
+      <w:lvlJc w:val="left"/>
+      <w:pPr>
+        <w:ind w:left="720" w:hanging="360"/>
+      </w:pPr>
+      <w:rPr>
+        <w:rFonts w:ascii="Symbol" w:hAnsi="Symbol" w:hint="default"/>
+      </w:rPr>
+    </w:lvl>
+    <w:lvl w:ilvl="1" w:tplc="04090003" w:tentative="1">
+      <w:start w:val="1"/>
+      <w:numFmt w:val="bullet"/>
+      <w:lvlText w:val="o"/>
+      <w:lvlJc w:val="left"/>
+      <w:pPr>
+        <w:ind w:left="1440" w:hanging="360"/>
+      </w:pPr>
+      <w:rPr>
+        <w:rFonts w:ascii="Courier New" w:hAnsi="Courier New" w:cs="Courier New" w:hint="default"/>
+      </w:rPr>
+    </w:lvl>
+    <w:lvl w:ilvl="2" w:tplc="04090005" w:tentative="1">
+      <w:start w:val="1"/>
+      <w:numFmt w:val="bullet"/>
+      <w:lvlText w:val=""/>
+      <w:lvlJc w:val="left"/>
+      <w:pPr>
+        <w:ind w:left="2160" w:hanging="360"/>
+      </w:pPr>
+      <w:rPr>
+        <w:rFonts w:ascii="Wingdings" w:hAnsi="Wingdings" w:hint="default"/>
+      </w:rPr>
+    </w:lvl>
+    <w:lvl w:ilvl="3" w:tplc="04090001" w:tentative="1">
+      <w:start w:val="1"/>
+      <w:numFmt w:val="bullet"/>
+      <w:lvlText w:val=""/>
+      <w:lvlJc w:val="left"/>
+      <w:pPr>
+        <w:ind w:left="2880" w:hanging="360"/>
+      </w:pPr>
+      <w:rPr>
+        <w:rFonts w:ascii="Symbol" w:hAnsi="Symbol" w:hint="default"/>
+      </w:rPr>
+    </w:lvl>
+    <w:lvl w:ilvl="4" w:tplc="04090003" w:tentative="1">
+      <w:start w:val="1"/>
+      <w:numFmt w:val="bullet"/>
+      <w:lvlText w:val="o"/>
+      <w:lvlJc w:val="left"/>
+      <w:pPr>
+        <w:ind w:left="3600" w:hanging="360"/>
+      </w:pPr>
+      <w:rPr>
+        <w:rFonts w:ascii="Courier New" w:hAnsi="Courier New" w:cs="Courier New" w:hint="default"/>
+      </w:rPr>
+    </w:lvl>
+    <w:lvl w:ilvl="5" w:tplc="04090005" w:tentative="1">
+      <w:start w:val="1"/>
+      <w:numFmt w:val="bullet"/>
+      <w:lvlText w:val=""/>
+      <w:lvlJc w:val="left"/>
+      <w:pPr>
+        <w:ind w:left="4320" w:hanging="360"/>
+      </w:pPr>
+      <w:rPr>
+        <w:rFonts w:ascii="Wingdings" w:hAnsi="Wingdings" w:hint="default"/>
+      </w:rPr>
+    </w:lvl>
+    <w:lvl w:ilvl="6" w:tplc="04090001" w:tentative="1">
+      <w:start w:val="1"/>
+      <w:numFmt w:val="bullet"/>
+      <w:lvlText w:val=""/>
+      <w:lvlJc w:val="left"/>
+      <w:pPr>
+        <w:ind w:left="5040" w:hanging="360"/>
+      </w:pPr>
+      <w:rPr>
+        <w:rFonts w:ascii="Symbol" w:hAnsi="Symbol" w:hint="default"/>
+      </w:rPr>
+    </w:lvl>
+    <w:lvl w:ilvl="7" w:tplc="04090003" w:tentative="1">
+      <w:start w:val="1"/>
+      <w:numFmt w:val="bullet"/>
+      <w:lvlText w:val="o"/>
+      <w:lvlJc w:val="left"/>
+      <w:pPr>
+        <w:ind w:left="5760" w:hanging="360"/>
+      </w:pPr>
+      <w:rPr>
+        <w:rFonts w:ascii="Courier New" w:hAnsi="Courier New" w:cs="Courier New" w:hint="default"/>
+      </w:rPr>
+    </w:lvl>
+    <w:lvl w:ilvl="8" w:tplc="04090005" w:tentative="1">
+      <w:start w:val="1"/>
+      <w:numFmt w:val="bullet"/>
+      <w:lvlText w:val=""/>
+      <w:lvlJc w:val="left"/>
+      <w:pPr>
+        <w:ind w:left="6480" w:hanging="360"/>
+      </w:pPr>
+      <w:rPr>
+        <w:rFonts w:ascii="Wingdings" w:hAnsi="Wingdings" w:hint="default"/>
+      </w:rPr>
+    </w:lvl>
+  </w:abstractNum>
+  <w:abstractNum w:abstractNumId="3" w15:restartNumberingAfterBreak="0">
     <w:nsid w:val="176C3E1D"/>
     <w:multiLevelType w:val="hybridMultilevel"/>
     <w:tmpl w:val="383E1A2A"/>
@@ -279,7 +1383,119 @@
       </w:rPr>
     </w:lvl>
   </w:abstractNum>
-  <w:abstractNum w:abstractNumId="2" w15:restartNumberingAfterBreak="0">
+  <w:abstractNum w:abstractNumId="4" w15:restartNumberingAfterBreak="0">
+    <w:nsid w:val="1D045FC3"/>
+    <w:multiLevelType w:val="hybridMultilevel"/>
+    <w:tmpl w:val="27069F82"/>
+    <w:lvl w:ilvl="0" w:tplc="7B96A548">
+      <w:numFmt w:val="bullet"/>
+      <w:lvlText w:val="-"/>
+      <w:lvlJc w:val="left"/>
+      <w:pPr>
+        <w:ind w:left="720" w:hanging="360"/>
+      </w:pPr>
+      <w:rPr>
+        <w:rFonts w:ascii="Calibri" w:eastAsiaTheme="minorHAnsi" w:hAnsi="Calibri" w:cs="Calibri" w:hint="default"/>
+      </w:rPr>
+    </w:lvl>
+    <w:lvl w:ilvl="1" w:tplc="04090003" w:tentative="1">
+      <w:start w:val="1"/>
+      <w:numFmt w:val="bullet"/>
+      <w:lvlText w:val="o"/>
+      <w:lvlJc w:val="left"/>
+      <w:pPr>
+        <w:ind w:left="1440" w:hanging="360"/>
+      </w:pPr>
+      <w:rPr>
+        <w:rFonts w:ascii="Courier New" w:hAnsi="Courier New" w:cs="Courier New" w:hint="default"/>
+      </w:rPr>
+    </w:lvl>
+    <w:lvl w:ilvl="2" w:tplc="04090005" w:tentative="1">
+      <w:start w:val="1"/>
+      <w:numFmt w:val="bullet"/>
+      <w:lvlText w:val=""/>
+      <w:lvlJc w:val="left"/>
+      <w:pPr>
+        <w:ind w:left="2160" w:hanging="360"/>
+      </w:pPr>
+      <w:rPr>
+        <w:rFonts w:ascii="Wingdings" w:hAnsi="Wingdings" w:hint="default"/>
+      </w:rPr>
+    </w:lvl>
+    <w:lvl w:ilvl="3" w:tplc="04090001" w:tentative="1">
+      <w:start w:val="1"/>
+      <w:numFmt w:val="bullet"/>
+      <w:lvlText w:val=""/>
+      <w:lvlJc w:val="left"/>
+      <w:pPr>
+        <w:ind w:left="2880" w:hanging="360"/>
+      </w:pPr>
+      <w:rPr>
+        <w:rFonts w:ascii="Symbol" w:hAnsi="Symbol" w:hint="default"/>
+      </w:rPr>
+    </w:lvl>
+    <w:lvl w:ilvl="4" w:tplc="04090003" w:tentative="1">
+      <w:start w:val="1"/>
+      <w:numFmt w:val="bullet"/>
+      <w:lvlText w:val="o"/>
+      <w:lvlJc w:val="left"/>
+      <w:pPr>
+        <w:ind w:left="3600" w:hanging="360"/>
+      </w:pPr>
+      <w:rPr>
+        <w:rFonts w:ascii="Courier New" w:hAnsi="Courier New" w:cs="Courier New" w:hint="default"/>
+      </w:rPr>
+    </w:lvl>
+    <w:lvl w:ilvl="5" w:tplc="04090005" w:tentative="1">
+      <w:start w:val="1"/>
+      <w:numFmt w:val="bullet"/>
+      <w:lvlText w:val=""/>
+      <w:lvlJc w:val="left"/>
+      <w:pPr>
+        <w:ind w:left="4320" w:hanging="360"/>
+      </w:pPr>
+      <w:rPr>
+        <w:rFonts w:ascii="Wingdings" w:hAnsi="Wingdings" w:hint="default"/>
+      </w:rPr>
+    </w:lvl>
+    <w:lvl w:ilvl="6" w:tplc="04090001" w:tentative="1">
+      <w:start w:val="1"/>
+      <w:numFmt w:val="bullet"/>
+      <w:lvlText w:val=""/>
+      <w:lvlJc w:val="left"/>
+      <w:pPr>
+        <w:ind w:left="5040" w:hanging="360"/>
+      </w:pPr>
+      <w:rPr>
+        <w:rFonts w:ascii="Symbol" w:hAnsi="Symbol" w:hint="default"/>
+      </w:rPr>
+    </w:lvl>
+    <w:lvl w:ilvl="7" w:tplc="04090003" w:tentative="1">
+      <w:start w:val="1"/>
+      <w:numFmt w:val="bullet"/>
+      <w:lvlText w:val="o"/>
+      <w:lvlJc w:val="left"/>
+      <w:pPr>
+        <w:ind w:left="5760" w:hanging="360"/>
+      </w:pPr>
+      <w:rPr>
+        <w:rFonts w:ascii="Courier New" w:hAnsi="Courier New" w:cs="Courier New" w:hint="default"/>
+      </w:rPr>
+    </w:lvl>
+    <w:lvl w:ilvl="8" w:tplc="04090005" w:tentative="1">
+      <w:start w:val="1"/>
+      <w:numFmt w:val="bullet"/>
+      <w:lvlText w:val=""/>
+      <w:lvlJc w:val="left"/>
+      <w:pPr>
+        <w:ind w:left="6480" w:hanging="360"/>
+      </w:pPr>
+      <w:rPr>
+        <w:rFonts w:ascii="Wingdings" w:hAnsi="Wingdings" w:hint="default"/>
+      </w:rPr>
+    </w:lvl>
+  </w:abstractNum>
+  <w:abstractNum w:abstractNumId="5" w15:restartNumberingAfterBreak="0">
     <w:nsid w:val="30612595"/>
     <w:multiLevelType w:val="hybridMultilevel"/>
     <w:tmpl w:val="DD7435CA"/>
@@ -365,7 +1581,120 @@
       </w:pPr>
     </w:lvl>
   </w:abstractNum>
-  <w:abstractNum w:abstractNumId="3" w15:restartNumberingAfterBreak="0">
+  <w:abstractNum w:abstractNumId="6" w15:restartNumberingAfterBreak="0">
+    <w:nsid w:val="36F92FB9"/>
+    <w:multiLevelType w:val="hybridMultilevel"/>
+    <w:tmpl w:val="F176C1B6"/>
+    <w:lvl w:ilvl="0" w:tplc="04090001">
+      <w:start w:val="1"/>
+      <w:numFmt w:val="bullet"/>
+      <w:lvlText w:val=""/>
+      <w:lvlJc w:val="left"/>
+      <w:pPr>
+        <w:ind w:left="720" w:hanging="360"/>
+      </w:pPr>
+      <w:rPr>
+        <w:rFonts w:ascii="Symbol" w:hAnsi="Symbol" w:hint="default"/>
+      </w:rPr>
+    </w:lvl>
+    <w:lvl w:ilvl="1" w:tplc="04090003" w:tentative="1">
+      <w:start w:val="1"/>
+      <w:numFmt w:val="bullet"/>
+      <w:lvlText w:val="o"/>
+      <w:lvlJc w:val="left"/>
+      <w:pPr>
+        <w:ind w:left="1440" w:hanging="360"/>
+      </w:pPr>
+      <w:rPr>
+        <w:rFonts w:ascii="Courier New" w:hAnsi="Courier New" w:cs="Courier New" w:hint="default"/>
+      </w:rPr>
+    </w:lvl>
+    <w:lvl w:ilvl="2" w:tplc="04090005" w:tentative="1">
+      <w:start w:val="1"/>
+      <w:numFmt w:val="bullet"/>
+      <w:lvlText w:val=""/>
+      <w:lvlJc w:val="left"/>
+      <w:pPr>
+        <w:ind w:left="2160" w:hanging="360"/>
+      </w:pPr>
+      <w:rPr>
+        <w:rFonts w:ascii="Wingdings" w:hAnsi="Wingdings" w:hint="default"/>
+      </w:rPr>
+    </w:lvl>
+    <w:lvl w:ilvl="3" w:tplc="04090001" w:tentative="1">
+      <w:start w:val="1"/>
+      <w:numFmt w:val="bullet"/>
+      <w:lvlText w:val=""/>
+      <w:lvlJc w:val="left"/>
+      <w:pPr>
+        <w:ind w:left="2880" w:hanging="360"/>
+      </w:pPr>
+      <w:rPr>
+        <w:rFonts w:ascii="Symbol" w:hAnsi="Symbol" w:hint="default"/>
+      </w:rPr>
+    </w:lvl>
+    <w:lvl w:ilvl="4" w:tplc="04090003" w:tentative="1">
+      <w:start w:val="1"/>
+      <w:numFmt w:val="bullet"/>
+      <w:lvlText w:val="o"/>
+      <w:lvlJc w:val="left"/>
+      <w:pPr>
+        <w:ind w:left="3600" w:hanging="360"/>
+      </w:pPr>
+      <w:rPr>
+        <w:rFonts w:ascii="Courier New" w:hAnsi="Courier New" w:cs="Courier New" w:hint="default"/>
+      </w:rPr>
+    </w:lvl>
+    <w:lvl w:ilvl="5" w:tplc="04090005" w:tentative="1">
+      <w:start w:val="1"/>
+      <w:numFmt w:val="bullet"/>
+      <w:lvlText w:val=""/>
+      <w:lvlJc w:val="left"/>
+      <w:pPr>
+        <w:ind w:left="4320" w:hanging="360"/>
+      </w:pPr>
+      <w:rPr>
+        <w:rFonts w:ascii="Wingdings" w:hAnsi="Wingdings" w:hint="default"/>
+      </w:rPr>
+    </w:lvl>
+    <w:lvl w:ilvl="6" w:tplc="04090001" w:tentative="1">
+      <w:start w:val="1"/>
+      <w:numFmt w:val="bullet"/>
+      <w:lvlText w:val=""/>
+      <w:lvlJc w:val="left"/>
+      <w:pPr>
+        <w:ind w:left="5040" w:hanging="360"/>
+      </w:pPr>
+      <w:rPr>
+        <w:rFonts w:ascii="Symbol" w:hAnsi="Symbol" w:hint="default"/>
+      </w:rPr>
+    </w:lvl>
+    <w:lvl w:ilvl="7" w:tplc="04090003" w:tentative="1">
+      <w:start w:val="1"/>
+      <w:numFmt w:val="bullet"/>
+      <w:lvlText w:val="o"/>
+      <w:lvlJc w:val="left"/>
+      <w:pPr>
+        <w:ind w:left="5760" w:hanging="360"/>
+      </w:pPr>
+      <w:rPr>
+        <w:rFonts w:ascii="Courier New" w:hAnsi="Courier New" w:cs="Courier New" w:hint="default"/>
+      </w:rPr>
+    </w:lvl>
+    <w:lvl w:ilvl="8" w:tplc="04090005" w:tentative="1">
+      <w:start w:val="1"/>
+      <w:numFmt w:val="bullet"/>
+      <w:lvlText w:val=""/>
+      <w:lvlJc w:val="left"/>
+      <w:pPr>
+        <w:ind w:left="6480" w:hanging="360"/>
+      </w:pPr>
+      <w:rPr>
+        <w:rFonts w:ascii="Wingdings" w:hAnsi="Wingdings" w:hint="default"/>
+      </w:rPr>
+    </w:lvl>
+  </w:abstractNum>
+  <w:abstractNum w:abstractNumId="7" w15:restartNumberingAfterBreak="0">
     <w:nsid w:val="4C3E32FD"/>
     <w:multiLevelType w:val="hybridMultilevel"/>
     <w:tmpl w:val="50DC98FE"/>
@@ -451,7 +1780,7 @@
       </w:pPr>
     </w:lvl>
   </w:abstractNum>
-  <w:abstractNum w:abstractNumId="4" w15:restartNumberingAfterBreak="0">
+  <w:abstractNum w:abstractNumId="8" w15:restartNumberingAfterBreak="0">
     <w:nsid w:val="770A7D0A"/>
     <w:multiLevelType w:val="hybridMultilevel"/>
     <w:tmpl w:val="7E7E23B6"/>
@@ -541,19 +1870,31 @@
     </w:lvl>
   </w:abstractNum>
   <w:num w:numId="1" w16cid:durableId="859702735">
+    <w:abstractNumId w:val="3"/>
+  </w:num>
+  <w:num w:numId="2" w16cid:durableId="908269177">
+    <w:abstractNumId w:val="7"/>
+  </w:num>
+  <w:num w:numId="3" w16cid:durableId="598680261">
     <w:abstractNumId w:val="1"/>
   </w:num>
-  <w:num w:numId="2" w16cid:durableId="908269177">
-    <w:abstractNumId w:val="3"/>
+  <w:num w:numId="4" w16cid:durableId="2022197433">
+    <w:abstractNumId w:val="5"/>
   </w:num>
-  <w:num w:numId="3" w16cid:durableId="598680261">
-    <w:abstractNumId w:val="0"/>
+  <w:num w:numId="5" w16cid:durableId="402488303">
+    <w:abstractNumId w:val="8"/>
   </w:num>
-  <w:num w:numId="4" w16cid:durableId="2022197433">
+  <w:num w:numId="6" w16cid:durableId="1990281292">
+    <w:abstractNumId w:val="4"/>
+  </w:num>
+  <w:num w:numId="7" w16cid:durableId="963845816">
+    <w:abstractNumId w:val="6"/>
+  </w:num>
+  <w:num w:numId="8" w16cid:durableId="1028337620">
     <w:abstractNumId w:val="2"/>
   </w:num>
-  <w:num w:numId="5" w16cid:durableId="402488303">
-    <w:abstractNumId w:val="4"/>
+  <w:num w:numId="9" w16cid:durableId="152378062">
+    <w:abstractNumId w:val="0"/>
   </w:num>
 </w:numbering>
 </file>
@@ -1029,6 +2370,29 @@
       <w:szCs w:val="24"/>
     </w:rPr>
   </w:style>
+  <w:style w:type="paragraph" w:styleId="Heading4">
+    <w:name w:val="heading 4"/>
+    <w:basedOn w:val="Normal"/>
+    <w:next w:val="Normal"/>
+    <w:link w:val="Heading4Char"/>
+    <w:uiPriority w:val="9"/>
+    <w:semiHidden/>
+    <w:unhideWhenUsed/>
+    <w:qFormat/>
+    <w:rsid w:val="009D50F5"/>
+    <w:pPr>
+      <w:keepNext/>
+      <w:keepLines/>
+      <w:spacing w:before="40" w:after="0"/>
+      <w:outlineLvl w:val="3"/>
+    </w:pPr>
+    <w:rPr>
+      <w:rFonts w:asciiTheme="majorHAnsi" w:eastAsiaTheme="majorEastAsia" w:hAnsiTheme="majorHAnsi" w:cstheme="majorBidi"/>
+      <w:i/>
+      <w:iCs/>
+      <w:color w:val="2F5496" w:themeColor="accent1" w:themeShade="BF"/>
+    </w:rPr>
+  </w:style>
   <w:style w:type="character" w:default="1" w:styleId="DefaultParagraphFont">
     <w:name w:val="Default Paragraph Font"/>
     <w:uiPriority w:val="1"/>
@@ -1147,6 +2511,22 @@
       <w:rFonts w:ascii="Consolas" w:hAnsi="Consolas" w:cs="Calibri"/>
       <w:sz w:val="20"/>
       <w:szCs w:val="20"/>
+    </w:rPr>
+  </w:style>
+  <w:style w:type="character" w:customStyle="1" w:styleId="Heading4Char">
+    <w:name w:val="Heading 4 Char"/>
+    <w:basedOn w:val="DefaultParagraphFont"/>
+    <w:link w:val="Heading4"/>
+    <w:uiPriority w:val="9"/>
+    <w:semiHidden/>
+    <w:rsid w:val="009D50F5"/>
+    <w:rPr>
+      <w:rFonts w:asciiTheme="majorHAnsi" w:eastAsiaTheme="majorEastAsia" w:hAnsiTheme="majorHAnsi" w:cstheme="majorBidi"/>
+      <w:i/>
+      <w:iCs/>
+      <w:color w:val="2F5496" w:themeColor="accent1" w:themeShade="BF"/>
+      <w:sz w:val="24"/>
+      <w:szCs w:val="28"/>
     </w:rPr>
   </w:style>
 </w:styles>

</xml_diff>

<commit_message>
Split User Flow Diagrams into a separate document
</commit_message>
<xml_diff>
--- a/docs/Report/System Architecture.docx
+++ b/docs/Report/System Architecture.docx
@@ -276,7 +276,7 @@
       </w:pPr>
       <w:r>
         <w:pict w14:anchorId="56721042">
-          <v:rect id="_x0000_i1038" style="width:0;height:0" o:hralign="center" o:hrstd="t" o:hr="t" fillcolor="#a0a0a0" stroked="f"/>
+          <v:rect id="_x0000_i1026" style="width:0;height:0" o:hralign="center" o:hrstd="t" o:hr="t" fillcolor="#a0a0a0" stroked="f"/>
         </w:pict>
       </w:r>
     </w:p>
@@ -957,7 +957,7 @@
       </w:pPr>
       <w:r>
         <w:pict w14:anchorId="4B45FE31">
-          <v:rect id="_x0000_i1042" style="width:0;height:0" o:hralign="center" o:hrstd="t" o:hr="t" fillcolor="#a0a0a0" stroked="f"/>
+          <v:rect id="_x0000_i1032" style="width:0;height:0" o:hralign="center" o:hrstd="t" o:hr="t" fillcolor="#a0a0a0" stroked="f"/>
         </w:pict>
       </w:r>
     </w:p>

</xml_diff>